<commit_message>
Add Section 3, Company; fix Word table column widths
Prose as supplied. Table 3 (renumbered from the draft's Table 4, since
Section 2 uses Tables 1 and 2) rebuilt in house style. Figures 5 and 6
redrawn.

Figure 5 adds a source-of-capital band beneath the stages and a marker for
where the company actually is. The caption already claimed each stage earns
the next source of capital; the figure now shows it rather than leaving it
to the prose.

Dropped one line, 'Olera's progression from R&D to commercial scale', which
restated Figure 5's caption and stranded itself at a page break.

Word export fix affecting Sections 2 and 3: a fixed-layout table is laid out
from tblGrid, so setting only cell widths left the grid at add_table's equal
columns and the column proportions came out wrong in Word while the PDF was
correct. Section 2's .docx is rebuilt with the fix.

Co-Authored-By: Claude Opus 5 <noreply@anthropic.com>
Claude-Session: https://claude.ai/code/session_01HAZLkLE85rjRAgcZW1sudJ
</commit_message>
<xml_diff>
--- a/docs/crp/passes/Olera_CRP_Section2_Value.docx
+++ b/docs/crp/passes/Olera_CRP_Section2_Value.docx
@@ -168,10 +168,10 @@
         <w:tblLayout w:type="fixed"/>
       </w:tblPr>
       <w:tblGrid>
-        <w:gridCol w:w="2700"/>
-        <w:gridCol w:w="2700"/>
-        <w:gridCol w:w="2700"/>
-        <w:gridCol w:w="2700"/>
+        <w:gridCol w:w="1404"/>
+        <w:gridCol w:w="2592"/>
+        <w:gridCol w:w="3240"/>
+        <w:gridCol w:w="3564"/>
       </w:tblGrid>
       <w:tr>
         <w:tc>
@@ -1047,9 +1047,9 @@
         <w:tblLayout w:type="fixed"/>
       </w:tblPr>
       <w:tblGrid>
-        <w:gridCol w:w="3600"/>
-        <w:gridCol w:w="3600"/>
-        <w:gridCol w:w="3600"/>
+        <w:gridCol w:w="4104"/>
+        <w:gridCol w:w="3240"/>
+        <w:gridCol w:w="3456"/>
       </w:tblGrid>
       <w:tr>
         <w:tc>

</xml_diff>